<commit_message>
docs(legal): proposed amendments on leadership, decision rights, tie-breaks and the fee
Section 6 of the statute additions: a five-year renewable term for the
Executive Director with the founder elected first, dismissal only for cause
by two-thirds of all members, the Director deciding everything not
reserved, casting votes for the Presidents of the Assembly and the Board
except on pay and dismissals, a founder expelled only by two-thirds, and the
membership fee as a yearly Assembly decision that may be zero. Not yet
applied to form 04a; the lawyer's list grows by five points.

Co-Authored-By: Claude Fable 5.1 <noreply@anthropic.com>
Claude-Session: https://claude.ai/code/session_01AVM926ubKsaqkthGFjJRy4
</commit_message>
<xml_diff>
--- a/docs/legal/dist/statute-additions.docx
+++ b/docs/legal/dist/statute-additions.docx
@@ -4335,7 +4335,7 @@
                 <w:sz w:val="22"/>
                 <w:szCs w:val="22"/>
               </w:rPr>
-              <w:t xml:space="preserve">Pitanja za advokata</w:t>
+              <w:t xml:space="preserve">Predložene izmjene od 21. 10. 2026: rukovođenje, nadležnosti, zastoj u odlučivanju, članstvo</w:t>
             </w:r>
           </w:p>
         </w:tc>
@@ -4360,7 +4360,1191 @@
                 <w:sz w:val="22"/>
                 <w:szCs w:val="22"/>
               </w:rPr>
-              <w:t xml:space="preserve">6. Points for the lawyer</w:t>
+              <w:t xml:space="preserve">6. Proposed amendments of 2026-10-21: leadership, decision rights, deadlock, membership</w:t>
+            </w:r>
+          </w:p>
+        </w:tc>
+      </w:tr>
+      <w:tr>
+        <w:tc>
+          <w:tcPr>
+            <w:tcW w:type="dxa" w:w="9906"/>
+            <w:gridSpan w:val="2"/>
+            <w:tcMar>
+              <w:top w:type="dxa" w:w="80"/>
+              <w:left w:type="dxa" w:w="100"/>
+              <w:bottom w:type="dxa" w:w="80"/>
+              <w:right w:type="dxa" w:w="100"/>
+            </w:tcMar>
+          </w:tcPr>
+          <w:p>
+            <w:pPr>
+              <w:spacing w:after="100"/>
+            </w:pPr>
+            <w:r>
+              <w:rPr>
+                <w:rFonts w:ascii="Arial" w:cs="Arial" w:eastAsia="Arial" w:hAnsi="Arial"/>
+                <w:b/>
+                <w:bCs/>
+                <w:sz w:val="18"/>
+                <w:szCs w:val="18"/>
+              </w:rPr>
+              <w:t xml:space="preserve">Why.</w:t>
+            </w:r>
+            <w:r>
+              <w:rPr>
+                <w:rFonts w:ascii="Arial" w:cs="Arial" w:eastAsia="Arial" w:hAnsi="Arial"/>
+                <w:sz w:val="18"/>
+                <w:szCs w:val="18"/>
+              </w:rPr>
+              <w:t xml:space="preserve"> The founders asked for a clear hierarchy of decision-making, a way out of stalemates, a founder who leads the association for as long as possible, and a membership whose fee is waived for 2026. The Law makes the Assembly the highest body and keeps every elected office subject to the Assembly, so no statute can make a position permanent; what a statute can do is give the Executive Director a long renewable term, full operational authority by default, and a high bar for early dismissal, and give every collective body a tie-breaker. That is what is proposed. It keeps the independence promises already in the draft (independent Board majority, Grants Committee outside the founders' control), which is what sponsors and grant funders look for. </w:t>
+            </w:r>
+            <w:r>
+              <w:rPr>
+                <w:rFonts w:ascii="Arial" w:cs="Arial" w:eastAsia="Arial" w:hAnsi="Arial"/>
+                <w:b/>
+                <w:bCs/>
+                <w:sz w:val="18"/>
+                <w:szCs w:val="18"/>
+              </w:rPr>
+              <w:t xml:space="preserve">Not yet in form 04a:</w:t>
+            </w:r>
+            <w:r>
+              <w:rPr>
+                <w:rFonts w:ascii="Arial" w:cs="Arial" w:eastAsia="Arial" w:hAnsi="Arial"/>
+                <w:sz w:val="18"/>
+                <w:szCs w:val="18"/>
+              </w:rPr>
+              <w:t xml:space="preserve"> these edits are applied to the registration pack only once the founders adopt them.</w:t>
+            </w:r>
+          </w:p>
+        </w:tc>
+      </w:tr>
+      <w:tr>
+        <w:tc>
+          <w:tcPr>
+            <w:tcW w:type="dxa" w:w="9906"/>
+            <w:gridSpan w:val="2"/>
+            <w:tcMar>
+              <w:top w:type="dxa" w:w="80"/>
+              <w:left w:type="dxa" w:w="100"/>
+              <w:bottom w:type="dxa" w:w="80"/>
+              <w:right w:type="dxa" w:w="100"/>
+            </w:tcMar>
+          </w:tcPr>
+          <w:p>
+            <w:pPr>
+              <w:spacing w:after="100"/>
+            </w:pPr>
+            <w:r>
+              <w:rPr>
+                <w:rFonts w:ascii="Arial" w:cs="Arial" w:eastAsia="Arial" w:hAnsi="Arial"/>
+                <w:b/>
+                <w:bCs/>
+                <w:sz w:val="18"/>
+                <w:szCs w:val="18"/>
+              </w:rPr>
+              <w:t xml:space="preserve">Zašto.</w:t>
+            </w:r>
+            <w:r>
+              <w:rPr>
+                <w:rFonts w:ascii="Arial" w:cs="Arial" w:eastAsia="Arial" w:hAnsi="Arial"/>
+                <w:sz w:val="18"/>
+                <w:szCs w:val="18"/>
+              </w:rPr>
+              <w:t xml:space="preserve"> Osnivači su tražili jasnu hijerarhiju odlučivanja, izlaz iz zastoja, osnivača koji vodi udruženje što je duže moguće i članstvo bez članarine za 2026. Zakon određuje Skupštinu kao najviši organ i svaku izabranu funkciju ostavlja pod njenom kontrolom, pa nijedan statut ne može neku funkciju učiniti trajnom; statut može Izvršnom direktoru dati dug mandat sa mogućnošću ponovnog izbora, punu operativnu nadležnost i visok prag za prijevremeno razrješenje, a svakom kolektivnom organu pravilo za neriješen ishod glasanja. To se ovdje predlaže. Zadržavaju se obećanja o nezavisnosti iz postojećeg nacrta (nezavisna većina u Upravnom odboru, Komisija izvan uticaja osnivača), na koja gledaju sponzori i donatori grantova. </w:t>
+            </w:r>
+            <w:r>
+              <w:rPr>
+                <w:rFonts w:ascii="Arial" w:cs="Arial" w:eastAsia="Arial" w:hAnsi="Arial"/>
+                <w:b/>
+                <w:bCs/>
+                <w:sz w:val="18"/>
+                <w:szCs w:val="18"/>
+              </w:rPr>
+              <w:t xml:space="preserve">Još nije u obrascu 04a:</w:t>
+            </w:r>
+            <w:r>
+              <w:rPr>
+                <w:rFonts w:ascii="Arial" w:cs="Arial" w:eastAsia="Arial" w:hAnsi="Arial"/>
+                <w:sz w:val="18"/>
+                <w:szCs w:val="18"/>
+              </w:rPr>
+              <w:t xml:space="preserve"> ove izmjene se unose u registracioni paket tek kada ih osnivači usvoje.</w:t>
+            </w:r>
+          </w:p>
+        </w:tc>
+      </w:tr>
+      <w:tr>
+        <w:tc>
+          <w:tcPr>
+            <w:tcW w:type="dxa" w:w="9906"/>
+            <w:gridSpan w:val="2"/>
+            <w:tcMar>
+              <w:top w:type="dxa" w:w="80"/>
+              <w:left w:type="dxa" w:w="100"/>
+              <w:bottom w:type="dxa" w:w="80"/>
+              <w:right w:type="dxa" w:w="100"/>
+            </w:tcMar>
+          </w:tcPr>
+          <w:tbl>
+            <w:tblPr>
+              <w:tblW w:type="dxa" w:w="9706"/>
+              <w:tblBorders>
+                <w:top w:val="single" w:color="C9D3D7" w:sz="4"/>
+                <w:left w:val="single" w:color="C9D3D7" w:sz="4"/>
+                <w:bottom w:val="single" w:color="C9D3D7" w:sz="4"/>
+                <w:right w:val="single" w:color="C9D3D7" w:sz="4"/>
+                <w:insideH w:val="single" w:color="C9D3D7" w:sz="4"/>
+                <w:insideV w:val="single" w:color="C9D3D7" w:sz="4"/>
+              </w:tblBorders>
+            </w:tblPr>
+            <w:tblGrid>
+              <w:gridCol w:w="3235"/>
+              <w:gridCol w:w="3235"/>
+              <w:gridCol w:w="3235"/>
+            </w:tblGrid>
+            <w:tr>
+              <w:trPr>
+                <w:tblHeader/>
+              </w:trPr>
+              <w:tc>
+                <w:tcPr>
+                  <w:tcW w:type="dxa" w:w="3235"/>
+                  <w:shd w:fill="E3EBED" w:color="auto" w:val="clear"/>
+                  <w:tcMar>
+                    <w:top w:type="dxa" w:w="40"/>
+                    <w:left w:type="dxa" w:w="60"/>
+                    <w:bottom w:type="dxa" w:w="40"/>
+                    <w:right w:type="dxa" w:w="60"/>
+                  </w:tcMar>
+                </w:tcPr>
+                <w:p>
+                  <w:r>
+                    <w:rPr>
+                      <w:rFonts w:ascii="Arial" w:cs="Arial" w:eastAsia="Arial" w:hAnsi="Arial"/>
+                      <w:b/>
+                      <w:bCs/>
+                      <w:sz w:val="16"/>
+                      <w:szCs w:val="16"/>
+                    </w:rPr>
+                    <w:t xml:space="preserve">Article / Član</w:t>
+                  </w:r>
+                </w:p>
+              </w:tc>
+              <w:tc>
+                <w:tcPr>
+                  <w:tcW w:type="dxa" w:w="3235"/>
+                  <w:shd w:fill="E3EBED" w:color="auto" w:val="clear"/>
+                  <w:tcMar>
+                    <w:top w:type="dxa" w:w="40"/>
+                    <w:left w:type="dxa" w:w="60"/>
+                    <w:bottom w:type="dxa" w:w="40"/>
+                    <w:right w:type="dxa" w:w="60"/>
+                  </w:tcMar>
+                </w:tcPr>
+                <w:p>
+                  <w:r>
+                    <w:rPr>
+                      <w:rFonts w:ascii="Arial" w:cs="Arial" w:eastAsia="Arial" w:hAnsi="Arial"/>
+                      <w:b/>
+                      <w:bCs/>
+                      <w:sz w:val="16"/>
+                      <w:szCs w:val="16"/>
+                    </w:rPr>
+                    <w:t xml:space="preserve">Change (EN)</w:t>
+                  </w:r>
+                </w:p>
+              </w:tc>
+              <w:tc>
+                <w:tcPr>
+                  <w:tcW w:type="dxa" w:w="3235"/>
+                  <w:shd w:fill="E3EBED" w:color="auto" w:val="clear"/>
+                  <w:tcMar>
+                    <w:top w:type="dxa" w:w="40"/>
+                    <w:left w:type="dxa" w:w="60"/>
+                    <w:bottom w:type="dxa" w:w="40"/>
+                    <w:right w:type="dxa" w:w="60"/>
+                  </w:tcMar>
+                </w:tcPr>
+                <w:p>
+                  <w:r>
+                    <w:rPr>
+                      <w:rFonts w:ascii="Arial" w:cs="Arial" w:eastAsia="Arial" w:hAnsi="Arial"/>
+                      <w:b/>
+                      <w:bCs/>
+                      <w:sz w:val="16"/>
+                      <w:szCs w:val="16"/>
+                    </w:rPr>
+                    <w:t xml:space="preserve">Izmjena (ME)</w:t>
+                  </w:r>
+                </w:p>
+              </w:tc>
+            </w:tr>
+            <w:tr>
+              <w:trPr>
+                <w:tblHeader w:val="off"/>
+              </w:trPr>
+              <w:tc>
+                <w:tcPr>
+                  <w:tcW w:type="dxa" w:w="3235"/>
+                  <w:tcMar>
+                    <w:top w:type="dxa" w:w="40"/>
+                    <w:left w:type="dxa" w:w="60"/>
+                    <w:bottom w:type="dxa" w:w="40"/>
+                    <w:right w:type="dxa" w:w="60"/>
+                  </w:tcMar>
+                </w:tcPr>
+                <w:p>
+                  <w:r>
+                    <w:rPr>
+                      <w:rFonts w:ascii="Arial" w:cs="Arial" w:eastAsia="Arial" w:hAnsi="Arial"/>
+                      <w:b w:val="false"/>
+                      <w:bCs w:val="false"/>
+                      <w:sz w:val="16"/>
+                      <w:szCs w:val="16"/>
+                    </w:rPr>
+                    <w:t xml:space="preserve">Art. 27 (Director's term)</w:t>
+                  </w:r>
+                </w:p>
+              </w:tc>
+              <w:tc>
+                <w:tcPr>
+                  <w:tcW w:type="dxa" w:w="3235"/>
+                  <w:tcMar>
+                    <w:top w:type="dxa" w:w="40"/>
+                    <w:left w:type="dxa" w:w="60"/>
+                    <w:bottom w:type="dxa" w:w="40"/>
+                    <w:right w:type="dxa" w:w="60"/>
+                  </w:tcMar>
+                </w:tcPr>
+                <w:p>
+                  <w:r>
+                    <w:rPr>
+                      <w:rFonts w:ascii="Arial" w:cs="Arial" w:eastAsia="Arial" w:hAnsi="Arial"/>
+                      <w:b w:val="false"/>
+                      <w:bCs w:val="false"/>
+                      <w:sz w:val="16"/>
+                      <w:szCs w:val="16"/>
+                    </w:rPr>
+                    <w:t xml:space="preserve">Fill the blank with "five" years; add: "The same person may be re-elected without limit on the number of terms. The first Executive Director is elected by the founding assembly."</w:t>
+                  </w:r>
+                </w:p>
+              </w:tc>
+              <w:tc>
+                <w:tcPr>
+                  <w:tcW w:type="dxa" w:w="3235"/>
+                  <w:tcMar>
+                    <w:top w:type="dxa" w:w="40"/>
+                    <w:left w:type="dxa" w:w="60"/>
+                    <w:bottom w:type="dxa" w:w="40"/>
+                    <w:right w:type="dxa" w:w="60"/>
+                  </w:tcMar>
+                </w:tcPr>
+                <w:p>
+                  <w:r>
+                    <w:rPr>
+                      <w:rFonts w:ascii="Arial" w:cs="Arial" w:eastAsia="Arial" w:hAnsi="Arial"/>
+                      <w:b w:val="false"/>
+                      <w:bCs w:val="false"/>
+                      <w:sz w:val="16"/>
+                      <w:szCs w:val="16"/>
+                    </w:rPr>
+                    <w:t xml:space="preserve">Popuniti prazninu sa „pet“ godina; dodati: „Isto lice može biti ponovo birano bez ograničenja broja mandata. Prvog Izvršnog direktora bira osnivačka skupština.“</w:t>
+                  </w:r>
+                </w:p>
+              </w:tc>
+            </w:tr>
+            <w:tr>
+              <w:trPr>
+                <w:tblHeader w:val="off"/>
+              </w:trPr>
+              <w:tc>
+                <w:tcPr>
+                  <w:tcW w:type="dxa" w:w="3235"/>
+                  <w:tcMar>
+                    <w:top w:type="dxa" w:w="40"/>
+                    <w:left w:type="dxa" w:w="60"/>
+                    <w:bottom w:type="dxa" w:w="40"/>
+                    <w:right w:type="dxa" w:w="60"/>
+                  </w:tcMar>
+                </w:tcPr>
+                <w:p>
+                  <w:r>
+                    <w:rPr>
+                      <w:rFonts w:ascii="Arial" w:cs="Arial" w:eastAsia="Arial" w:hAnsi="Arial"/>
+                      <w:b w:val="false"/>
+                      <w:bCs w:val="false"/>
+                      <w:sz w:val="16"/>
+                      <w:szCs w:val="16"/>
+                    </w:rPr>
+                    <w:t xml:space="preserve">Art. 28 (Director's powers)</w:t>
+                  </w:r>
+                </w:p>
+              </w:tc>
+              <w:tc>
+                <w:tcPr>
+                  <w:tcW w:type="dxa" w:w="3235"/>
+                  <w:tcMar>
+                    <w:top w:type="dxa" w:w="40"/>
+                    <w:left w:type="dxa" w:w="60"/>
+                    <w:bottom w:type="dxa" w:w="40"/>
+                    <w:right w:type="dxa" w:w="60"/>
+                  </w:tcMar>
+                </w:tcPr>
+                <w:p>
+                  <w:r>
+                    <w:rPr>
+                      <w:rFonts w:ascii="Arial" w:cs="Arial" w:eastAsia="Arial" w:hAnsi="Arial"/>
+                      <w:b w:val="false"/>
+                      <w:bCs w:val="false"/>
+                      <w:sz w:val="16"/>
+                      <w:szCs w:val="16"/>
+                    </w:rPr>
+                    <w:t xml:space="preserve">Add a paragraph: "The Executive Director decides on every matter that the Law, this Statute or a decision of the Assembly does not reserve to another body, within the adopted budget and the spending limits the Board sets. Where the Board does not decide on a matter the Executive Director submitted to it, because it lacked a quorum at two consecutive sessions or because the vote was tied, the Executive Director may act within the adopted budget and reports on it at the Board's next session."</w:t>
+                  </w:r>
+                </w:p>
+              </w:tc>
+              <w:tc>
+                <w:tcPr>
+                  <w:tcW w:type="dxa" w:w="3235"/>
+                  <w:tcMar>
+                    <w:top w:type="dxa" w:w="40"/>
+                    <w:left w:type="dxa" w:w="60"/>
+                    <w:bottom w:type="dxa" w:w="40"/>
+                    <w:right w:type="dxa" w:w="60"/>
+                  </w:tcMar>
+                </w:tcPr>
+                <w:p>
+                  <w:r>
+                    <w:rPr>
+                      <w:rFonts w:ascii="Arial" w:cs="Arial" w:eastAsia="Arial" w:hAnsi="Arial"/>
+                      <w:b w:val="false"/>
+                      <w:bCs w:val="false"/>
+                      <w:sz w:val="16"/>
+                      <w:szCs w:val="16"/>
+                    </w:rPr>
+                    <w:t xml:space="preserve">Dodati stav: „Izvršni direktor odlučuje o svakom pitanju koje Zakon, ovaj statut ili odluka Skupštine ne stavlja u nadležnost drugog organa, u okviru usvojenog budžeta i ograničenja potrošnje koja utvrdi Upravni odbor. Ako Upravni odbor ne odluči o pitanju koje mu je Izvršni direktor podnio, zbog nedostatka kvoruma na dvije uzastopne sjednice ili jednakog broja glasova, Izvršni direktor može postupiti u okviru usvojenog budžeta i o tome izvještava na narednoj sjednici Upravnog odbora.“</w:t>
+                  </w:r>
+                </w:p>
+              </w:tc>
+            </w:tr>
+            <w:tr>
+              <w:trPr>
+                <w:tblHeader w:val="off"/>
+              </w:trPr>
+              <w:tc>
+                <w:tcPr>
+                  <w:tcW w:type="dxa" w:w="3235"/>
+                  <w:tcMar>
+                    <w:top w:type="dxa" w:w="40"/>
+                    <w:left w:type="dxa" w:w="60"/>
+                    <w:bottom w:type="dxa" w:w="40"/>
+                    <w:right w:type="dxa" w:w="60"/>
+                  </w:tcMar>
+                </w:tcPr>
+                <w:p>
+                  <w:r>
+                    <w:rPr>
+                      <w:rFonts w:ascii="Arial" w:cs="Arial" w:eastAsia="Arial" w:hAnsi="Arial"/>
+                      <w:b w:val="false"/>
+                      <w:bCs w:val="false"/>
+                      <w:sz w:val="16"/>
+                      <w:szCs w:val="16"/>
+                    </w:rPr>
+                    <w:t xml:space="preserve">Art. 30 and 31 (dismissal of the Director)</w:t>
+                  </w:r>
+                </w:p>
+              </w:tc>
+              <w:tc>
+                <w:tcPr>
+                  <w:tcW w:type="dxa" w:w="3235"/>
+                  <w:tcMar>
+                    <w:top w:type="dxa" w:w="40"/>
+                    <w:left w:type="dxa" w:w="60"/>
+                    <w:bottom w:type="dxa" w:w="40"/>
+                    <w:right w:type="dxa" w:w="60"/>
+                  </w:tcMar>
+                </w:tcPr>
+                <w:p>
+                  <w:r>
+                    <w:rPr>
+                      <w:rFonts w:ascii="Arial" w:cs="Arial" w:eastAsia="Arial" w:hAnsi="Arial"/>
+                      <w:b w:val="false"/>
+                      <w:bCs w:val="false"/>
+                      <w:sz w:val="16"/>
+                      <w:szCs w:val="16"/>
+                    </w:rPr>
+                    <w:t xml:space="preserve">Keep the three causes in Art. 30 and add to Art. 31: "The Assembly decides on the dismissal of the Executive Director before the end of the term only for a reason in Article 30, on the proposal of the Board or of at least one third of the members, by a two-thirds majority of all members of the association, after the Executive Director has been given the opportunity to respond. The Executive Director may be represented by proxy at that session but not act as a proxy."</w:t>
+                  </w:r>
+                </w:p>
+              </w:tc>
+              <w:tc>
+                <w:tcPr>
+                  <w:tcW w:type="dxa" w:w="3235"/>
+                  <w:tcMar>
+                    <w:top w:type="dxa" w:w="40"/>
+                    <w:left w:type="dxa" w:w="60"/>
+                    <w:bottom w:type="dxa" w:w="40"/>
+                    <w:right w:type="dxa" w:w="60"/>
+                  </w:tcMar>
+                </w:tcPr>
+                <w:p>
+                  <w:r>
+                    <w:rPr>
+                      <w:rFonts w:ascii="Arial" w:cs="Arial" w:eastAsia="Arial" w:hAnsi="Arial"/>
+                      <w:b w:val="false"/>
+                      <w:bCs w:val="false"/>
+                      <w:sz w:val="16"/>
+                      <w:szCs w:val="16"/>
+                    </w:rPr>
+                    <w:t xml:space="preserve">Zadržati tri razloga iz čl. 30 i u čl. 31 dodati: „Skupština odlučuje o razrješenju Izvršnog direktora prije isteka mandata samo iz razloga iz člana 30, na predlog Upravnog odbora ili najmanje jedne trećine članova, dvotrećinskom većinom svih članova udruženja, pošto je Izvršnom direktoru data mogućnost da se izjasni. Izvršni direktor na toj sjednici može biti predstavljen preko punomoćnika, ali ne može biti punomoćnik.“</w:t>
+                  </w:r>
+                </w:p>
+              </w:tc>
+            </w:tr>
+            <w:tr>
+              <w:trPr>
+                <w:tblHeader w:val="off"/>
+              </w:trPr>
+              <w:tc>
+                <w:tcPr>
+                  <w:tcW w:type="dxa" w:w="3235"/>
+                  <w:tcMar>
+                    <w:top w:type="dxa" w:w="40"/>
+                    <w:left w:type="dxa" w:w="60"/>
+                    <w:bottom w:type="dxa" w:w="40"/>
+                    <w:right w:type="dxa" w:w="60"/>
+                  </w:tcMar>
+                </w:tcPr>
+                <w:p>
+                  <w:r>
+                    <w:rPr>
+                      <w:rFonts w:ascii="Arial" w:cs="Arial" w:eastAsia="Arial" w:hAnsi="Arial"/>
+                      <w:b w:val="false"/>
+                      <w:bCs w:val="false"/>
+                      <w:sz w:val="16"/>
+                      <w:szCs w:val="16"/>
+                    </w:rPr>
+                    <w:t xml:space="preserve">Art. 19 (Assembly, other matters)</w:t>
+                  </w:r>
+                </w:p>
+              </w:tc>
+              <w:tc>
+                <w:tcPr>
+                  <w:tcW w:type="dxa" w:w="3235"/>
+                  <w:tcMar>
+                    <w:top w:type="dxa" w:w="40"/>
+                    <w:left w:type="dxa" w:w="60"/>
+                    <w:bottom w:type="dxa" w:w="40"/>
+                    <w:right w:type="dxa" w:w="60"/>
+                  </w:tcMar>
+                </w:tcPr>
+                <w:p>
+                  <w:r>
+                    <w:rPr>
+                      <w:rFonts w:ascii="Arial" w:cs="Arial" w:eastAsia="Arial" w:hAnsi="Arial"/>
+                      <w:b w:val="false"/>
+                      <w:bCs w:val="false"/>
+                      <w:sz w:val="16"/>
+                      <w:szCs w:val="16"/>
+                    </w:rPr>
+                    <w:t xml:space="preserve">Add: "If the votes are equal, the matter is put to a second vote at the same session after further discussion. If the votes are again equal, the vote of the President of the Assembly decides."</w:t>
+                  </w:r>
+                </w:p>
+              </w:tc>
+              <w:tc>
+                <w:tcPr>
+                  <w:tcW w:type="dxa" w:w="3235"/>
+                  <w:tcMar>
+                    <w:top w:type="dxa" w:w="40"/>
+                    <w:left w:type="dxa" w:w="60"/>
+                    <w:bottom w:type="dxa" w:w="40"/>
+                    <w:right w:type="dxa" w:w="60"/>
+                  </w:tcMar>
+                </w:tcPr>
+                <w:p>
+                  <w:r>
+                    <w:rPr>
+                      <w:rFonts w:ascii="Arial" w:cs="Arial" w:eastAsia="Arial" w:hAnsi="Arial"/>
+                      <w:b w:val="false"/>
+                      <w:bCs w:val="false"/>
+                      <w:sz w:val="16"/>
+                      <w:szCs w:val="16"/>
+                    </w:rPr>
+                    <w:t xml:space="preserve">Dodati: „Ako je broj glasova jednak, o pitanju se ponovo glasa na istoj sjednici poslije dodatne rasprave. Ako je broj glasova ponovo jednak, odlučuje glas Predsjednika Skupštine.“</w:t>
+                  </w:r>
+                </w:p>
+              </w:tc>
+            </w:tr>
+            <w:tr>
+              <w:trPr>
+                <w:tblHeader w:val="off"/>
+              </w:trPr>
+              <w:tc>
+                <w:tcPr>
+                  <w:tcW w:type="dxa" w:w="3235"/>
+                  <w:tcMar>
+                    <w:top w:type="dxa" w:w="40"/>
+                    <w:left w:type="dxa" w:w="60"/>
+                    <w:bottom w:type="dxa" w:w="40"/>
+                    <w:right w:type="dxa" w:w="60"/>
+                  </w:tcMar>
+                </w:tcPr>
+                <w:p>
+                  <w:r>
+                    <w:rPr>
+                      <w:rFonts w:ascii="Arial" w:cs="Arial" w:eastAsia="Arial" w:hAnsi="Arial"/>
+                      <w:b w:val="false"/>
+                      <w:bCs w:val="false"/>
+                      <w:sz w:val="16"/>
+                      <w:szCs w:val="16"/>
+                    </w:rPr>
+                    <w:t xml:space="preserve">Art. 35 (Board, decisions; section 2 above)</w:t>
+                  </w:r>
+                </w:p>
+              </w:tc>
+              <w:tc>
+                <w:tcPr>
+                  <w:tcW w:type="dxa" w:w="3235"/>
+                  <w:tcMar>
+                    <w:top w:type="dxa" w:w="40"/>
+                    <w:left w:type="dxa" w:w="60"/>
+                    <w:bottom w:type="dxa" w:w="40"/>
+                    <w:right w:type="dxa" w:w="60"/>
+                  </w:tcMar>
+                </w:tcPr>
+                <w:p>
+                  <w:r>
+                    <w:rPr>
+                      <w:rFonts w:ascii="Arial" w:cs="Arial" w:eastAsia="Arial" w:hAnsi="Arial"/>
+                      <w:b w:val="false"/>
+                      <w:bCs w:val="false"/>
+                      <w:sz w:val="16"/>
+                      <w:szCs w:val="16"/>
+                    </w:rPr>
+                    <w:t xml:space="preserve">Replace "If the number of votes is equal, the proposal is not adopted." with: "If the votes are equal, the vote of the President of the Board decides, except on the pay of any person, on a proposal to dismiss the Executive Director or a member of a body, and on the Executive Director's report, where an equal vote means the proposal is not adopted."</w:t>
+                  </w:r>
+                </w:p>
+              </w:tc>
+              <w:tc>
+                <w:tcPr>
+                  <w:tcW w:type="dxa" w:w="3235"/>
+                  <w:tcMar>
+                    <w:top w:type="dxa" w:w="40"/>
+                    <w:left w:type="dxa" w:w="60"/>
+                    <w:bottom w:type="dxa" w:w="40"/>
+                    <w:right w:type="dxa" w:w="60"/>
+                  </w:tcMar>
+                </w:tcPr>
+                <w:p>
+                  <w:r>
+                    <w:rPr>
+                      <w:rFonts w:ascii="Arial" w:cs="Arial" w:eastAsia="Arial" w:hAnsi="Arial"/>
+                      <w:b w:val="false"/>
+                      <w:bCs w:val="false"/>
+                      <w:sz w:val="16"/>
+                      <w:szCs w:val="16"/>
+                    </w:rPr>
+                    <w:t xml:space="preserve">Zamijeniti „Ako je broj glasova jednak, predlog nije usvojen.“ sa: „Ako je broj glasova jednak, odlučuje glas predsjednika Upravnog odbora, osim o zaradi ili naknadi bilo kog lica, o predlogu za razrješenje Izvršnog direktora ili člana organa i o izvještaju Izvršnog direktora, gdje jednak broj glasova znači da predlog nije usvojen.“</w:t>
+                  </w:r>
+                </w:p>
+              </w:tc>
+            </w:tr>
+            <w:tr>
+              <w:trPr>
+                <w:tblHeader w:val="off"/>
+              </w:trPr>
+              <w:tc>
+                <w:tcPr>
+                  <w:tcW w:type="dxa" w:w="3235"/>
+                  <w:tcMar>
+                    <w:top w:type="dxa" w:w="40"/>
+                    <w:left w:type="dxa" w:w="60"/>
+                    <w:bottom w:type="dxa" w:w="40"/>
+                    <w:right w:type="dxa" w:w="60"/>
+                  </w:tcMar>
+                </w:tcPr>
+                <w:p>
+                  <w:r>
+                    <w:rPr>
+                      <w:rFonts w:ascii="Arial" w:cs="Arial" w:eastAsia="Arial" w:hAnsi="Arial"/>
+                      <w:b w:val="false"/>
+                      <w:bCs w:val="false"/>
+                      <w:sz w:val="16"/>
+                      <w:szCs w:val="16"/>
+                    </w:rPr>
+                    <w:t xml:space="preserve">Art. 36 (old; termination of membership)</w:t>
+                  </w:r>
+                </w:p>
+              </w:tc>
+              <w:tc>
+                <w:tcPr>
+                  <w:tcW w:type="dxa" w:w="3235"/>
+                  <w:tcMar>
+                    <w:top w:type="dxa" w:w="40"/>
+                    <w:left w:type="dxa" w:w="60"/>
+                    <w:bottom w:type="dxa" w:w="40"/>
+                    <w:right w:type="dxa" w:w="60"/>
+                  </w:tcMar>
+                </w:tcPr>
+                <w:p>
+                  <w:r>
+                    <w:rPr>
+                      <w:rFonts w:ascii="Arial" w:cs="Arial" w:eastAsia="Arial" w:hAnsi="Arial"/>
+                      <w:b w:val="false"/>
+                      <w:bCs w:val="false"/>
+                      <w:sz w:val="16"/>
+                      <w:szCs w:val="16"/>
+                    </w:rPr>
+                    <w:t xml:space="preserve">Add: "The membership of a founder of the association ends only by the founder's written statement of withdrawal, or by a decision of the Assembly taken by a two-thirds majority of all members for a reason in paragraph 2 of this Article."</w:t>
+                  </w:r>
+                </w:p>
+              </w:tc>
+              <w:tc>
+                <w:tcPr>
+                  <w:tcW w:type="dxa" w:w="3235"/>
+                  <w:tcMar>
+                    <w:top w:type="dxa" w:w="40"/>
+                    <w:left w:type="dxa" w:w="60"/>
+                    <w:bottom w:type="dxa" w:w="40"/>
+                    <w:right w:type="dxa" w:w="60"/>
+                  </w:tcMar>
+                </w:tcPr>
+                <w:p>
+                  <w:r>
+                    <w:rPr>
+                      <w:rFonts w:ascii="Arial" w:cs="Arial" w:eastAsia="Arial" w:hAnsi="Arial"/>
+                      <w:b w:val="false"/>
+                      <w:bCs w:val="false"/>
+                      <w:sz w:val="16"/>
+                      <w:szCs w:val="16"/>
+                    </w:rPr>
+                    <w:t xml:space="preserve">Dodati: „Članstvo osnivača udruženja prestaje samo pisanom izjavom osnivača o istupanju, ili odlukom Skupštine donesenom dvotrećinskom većinom svih članova iz razloga iz stava 2 ovog člana.“</w:t>
+                  </w:r>
+                </w:p>
+              </w:tc>
+            </w:tr>
+            <w:tr>
+              <w:trPr>
+                <w:tblHeader w:val="off"/>
+              </w:trPr>
+              <w:tc>
+                <w:tcPr>
+                  <w:tcW w:type="dxa" w:w="3235"/>
+                  <w:tcMar>
+                    <w:top w:type="dxa" w:w="40"/>
+                    <w:left w:type="dxa" w:w="60"/>
+                    <w:bottom w:type="dxa" w:w="40"/>
+                    <w:right w:type="dxa" w:w="60"/>
+                  </w:tcMar>
+                </w:tcPr>
+                <w:p>
+                  <w:r>
+                    <w:rPr>
+                      <w:rFonts w:ascii="Arial" w:cs="Arial" w:eastAsia="Arial" w:hAnsi="Arial"/>
+                      <w:b w:val="false"/>
+                      <w:bCs w:val="false"/>
+                      <w:sz w:val="16"/>
+                      <w:szCs w:val="16"/>
+                    </w:rPr>
+                    <w:t xml:space="preserve">Art. 38 (old; rights and obligations of members)</w:t>
+                  </w:r>
+                </w:p>
+              </w:tc>
+              <w:tc>
+                <w:tcPr>
+                  <w:tcW w:type="dxa" w:w="3235"/>
+                  <w:tcMar>
+                    <w:top w:type="dxa" w:w="40"/>
+                    <w:left w:type="dxa" w:w="60"/>
+                    <w:bottom w:type="dxa" w:w="40"/>
+                    <w:right w:type="dxa" w:w="60"/>
+                  </w:tcMar>
+                </w:tcPr>
+                <w:p>
+                  <w:r>
+                    <w:rPr>
+                      <w:rFonts w:ascii="Arial" w:cs="Arial" w:eastAsia="Arial" w:hAnsi="Arial"/>
+                      <w:b w:val="false"/>
+                      <w:bCs w:val="false"/>
+                      <w:sz w:val="16"/>
+                      <w:szCs w:val="16"/>
+                    </w:rPr>
+                    <w:t xml:space="preserve">Add to the rights: "to propose causes for which the association raises funds, and to vote on the shortlist of causes;". Replace "pay the membership fee;" with "pay the membership fee, if the Assembly has set one for that calendar year;".</w:t>
+                  </w:r>
+                </w:p>
+              </w:tc>
+              <w:tc>
+                <w:tcPr>
+                  <w:tcW w:type="dxa" w:w="3235"/>
+                  <w:tcMar>
+                    <w:top w:type="dxa" w:w="40"/>
+                    <w:left w:type="dxa" w:w="60"/>
+                    <w:bottom w:type="dxa" w:w="40"/>
+                    <w:right w:type="dxa" w:w="60"/>
+                  </w:tcMar>
+                </w:tcPr>
+                <w:p>
+                  <w:r>
+                    <w:rPr>
+                      <w:rFonts w:ascii="Arial" w:cs="Arial" w:eastAsia="Arial" w:hAnsi="Arial"/>
+                      <w:b w:val="false"/>
+                      <w:bCs w:val="false"/>
+                      <w:sz w:val="16"/>
+                      <w:szCs w:val="16"/>
+                    </w:rPr>
+                    <w:t xml:space="preserve">Dodati u prava: „da predlaže ciljeve za koje udruženje prikuplja sredstva i da glasa o užem izboru ciljeva;“. Zamijeniti „plaća članarinu;“ sa „plaća članarinu, ako ju je Skupština utvrdila za tu kalendarsku godinu;“.</w:t>
+                  </w:r>
+                </w:p>
+              </w:tc>
+            </w:tr>
+            <w:tr>
+              <w:trPr>
+                <w:tblHeader w:val="off"/>
+              </w:trPr>
+              <w:tc>
+                <w:tcPr>
+                  <w:tcW w:type="dxa" w:w="3235"/>
+                  <w:tcMar>
+                    <w:top w:type="dxa" w:w="40"/>
+                    <w:left w:type="dxa" w:w="60"/>
+                    <w:bottom w:type="dxa" w:w="40"/>
+                    <w:right w:type="dxa" w:w="60"/>
+                  </w:tcMar>
+                </w:tcPr>
+                <w:p>
+                  <w:r>
+                    <w:rPr>
+                      <w:rFonts w:ascii="Arial" w:cs="Arial" w:eastAsia="Arial" w:hAnsi="Arial"/>
+                      <w:b w:val="false"/>
+                      <w:bCs w:val="false"/>
+                      <w:sz w:val="16"/>
+                      <w:szCs w:val="16"/>
+                    </w:rPr>
+                    <w:t xml:space="preserve">Art. 34 (old; financing)</w:t>
+                  </w:r>
+                </w:p>
+              </w:tc>
+              <w:tc>
+                <w:tcPr>
+                  <w:tcW w:type="dxa" w:w="3235"/>
+                  <w:tcMar>
+                    <w:top w:type="dxa" w:w="40"/>
+                    <w:left w:type="dxa" w:w="60"/>
+                    <w:bottom w:type="dxa" w:w="40"/>
+                    <w:right w:type="dxa" w:w="60"/>
+                  </w:tcMar>
+                </w:tcPr>
+                <w:p>
+                  <w:r>
+                    <w:rPr>
+                      <w:rFonts w:ascii="Arial" w:cs="Arial" w:eastAsia="Arial" w:hAnsi="Arial"/>
+                      <w:b w:val="false"/>
+                      <w:bCs w:val="false"/>
+                      <w:sz w:val="16"/>
+                      <w:szCs w:val="16"/>
+                    </w:rPr>
+                    <w:t xml:space="preserve">Add: "The Assembly decides, on the Board's proposal, whether a membership fee is charged for a calendar year and in what amount; it may decide that no fee is charged."</w:t>
+                  </w:r>
+                </w:p>
+              </w:tc>
+              <w:tc>
+                <w:tcPr>
+                  <w:tcW w:type="dxa" w:w="3235"/>
+                  <w:tcMar>
+                    <w:top w:type="dxa" w:w="40"/>
+                    <w:left w:type="dxa" w:w="60"/>
+                    <w:bottom w:type="dxa" w:w="40"/>
+                    <w:right w:type="dxa" w:w="60"/>
+                  </w:tcMar>
+                </w:tcPr>
+                <w:p>
+                  <w:r>
+                    <w:rPr>
+                      <w:rFonts w:ascii="Arial" w:cs="Arial" w:eastAsia="Arial" w:hAnsi="Arial"/>
+                      <w:b w:val="false"/>
+                      <w:bCs w:val="false"/>
+                      <w:sz w:val="16"/>
+                      <w:szCs w:val="16"/>
+                    </w:rPr>
+                    <w:t xml:space="preserve">Dodati: „Skupština odlučuje, na predlog Upravnog odbora, da li se za kalendarsku godinu naplaćuje članarina i u kom iznosu; može odlučiti da se članarina ne naplaćuje.“</w:t>
+                  </w:r>
+                </w:p>
+              </w:tc>
+            </w:tr>
+            <w:tr>
+              <w:trPr>
+                <w:tblHeader w:val="off"/>
+              </w:trPr>
+              <w:tc>
+                <w:tcPr>
+                  <w:tcW w:type="dxa" w:w="3235"/>
+                  <w:tcMar>
+                    <w:top w:type="dxa" w:w="40"/>
+                    <w:left w:type="dxa" w:w="60"/>
+                    <w:bottom w:type="dxa" w:w="40"/>
+                    <w:right w:type="dxa" w:w="60"/>
+                  </w:tcMar>
+                </w:tcPr>
+                <w:p>
+                  <w:r>
+                    <w:rPr>
+                      <w:rFonts w:ascii="Arial" w:cs="Arial" w:eastAsia="Arial" w:hAnsi="Arial"/>
+                      <w:b w:val="false"/>
+                      <w:bCs w:val="false"/>
+                      <w:sz w:val="16"/>
+                      <w:szCs w:val="16"/>
+                    </w:rPr>
+                    <w:t xml:space="preserve">New Art. 34a (optional; Advisory Council)</w:t>
+                  </w:r>
+                </w:p>
+              </w:tc>
+              <w:tc>
+                <w:tcPr>
+                  <w:tcW w:type="dxa" w:w="3235"/>
+                  <w:tcMar>
+                    <w:top w:type="dxa" w:w="40"/>
+                    <w:left w:type="dxa" w:w="60"/>
+                    <w:bottom w:type="dxa" w:w="40"/>
+                    <w:right w:type="dxa" w:w="60"/>
+                  </w:tcMar>
+                </w:tcPr>
+                <w:p>
+                  <w:r>
+                    <w:rPr>
+                      <w:rFonts w:ascii="Arial" w:cs="Arial" w:eastAsia="Arial" w:hAnsi="Arial"/>
+                      <w:b w:val="false"/>
+                      <w:bCs w:val="false"/>
+                      <w:sz w:val="16"/>
+                      <w:szCs w:val="16"/>
+                    </w:rPr>
+                    <w:t xml:space="preserve">"The Board may establish an Advisory Council of persons who support the association with advice and contacts. The Advisory Council has no decision-making powers and its members are not members of a body of the association." Include only if the founders want the dotted-line body shown on common non-profit charts.</w:t>
+                  </w:r>
+                </w:p>
+              </w:tc>
+              <w:tc>
+                <w:tcPr>
+                  <w:tcW w:type="dxa" w:w="3235"/>
+                  <w:tcMar>
+                    <w:top w:type="dxa" w:w="40"/>
+                    <w:left w:type="dxa" w:w="60"/>
+                    <w:bottom w:type="dxa" w:w="40"/>
+                    <w:right w:type="dxa" w:w="60"/>
+                  </w:tcMar>
+                </w:tcPr>
+                <w:p>
+                  <w:r>
+                    <w:rPr>
+                      <w:rFonts w:ascii="Arial" w:cs="Arial" w:eastAsia="Arial" w:hAnsi="Arial"/>
+                      <w:b w:val="false"/>
+                      <w:bCs w:val="false"/>
+                      <w:sz w:val="16"/>
+                      <w:szCs w:val="16"/>
+                    </w:rPr>
+                    <w:t xml:space="preserve">„Upravni odbor može obrazovati Savjet od lica koja udruženje podržavaju savjetom i kontaktima. Savjet nema nadležnost odlučivanja, a njegovi članovi nijesu članovi organa udruženja.“ Unijeti samo ako osnivači žele tijelo sa isprekidanom linijom koje se viđa na organigramima neprofitnih organizacija.</w:t>
+                  </w:r>
+                </w:p>
+              </w:tc>
+            </w:tr>
+          </w:tbl>
+          <w:p/>
+        </w:tc>
+      </w:tr>
+      <w:tr>
+        <w:tc>
+          <w:tcPr>
+            <w:tcW w:type="dxa" w:w="9906"/>
+            <w:gridSpan w:val="2"/>
+            <w:tcMar>
+              <w:top w:type="dxa" w:w="80"/>
+              <w:left w:type="dxa" w:w="100"/>
+              <w:bottom w:type="dxa" w:w="80"/>
+              <w:right w:type="dxa" w:w="100"/>
+            </w:tcMar>
+          </w:tcPr>
+          <w:p>
+            <w:pPr>
+              <w:spacing w:after="100"/>
+            </w:pPr>
+            <w:r>
+              <w:rPr>
+                <w:rFonts w:ascii="Arial" w:cs="Arial" w:eastAsia="Arial" w:hAnsi="Arial"/>
+                <w:b/>
+                <w:bCs/>
+                <w:sz w:val="18"/>
+                <w:szCs w:val="18"/>
+              </w:rPr>
+              <w:t xml:space="preserve">Decisions embedded here.</w:t>
+            </w:r>
+            <w:r>
+              <w:rPr>
+                <w:rFonts w:ascii="Arial" w:cs="Arial" w:eastAsia="Arial" w:hAnsi="Arial"/>
+                <w:sz w:val="18"/>
+                <w:szCs w:val="18"/>
+              </w:rPr>
+              <w:t xml:space="preserve"> Five-year Director term, re-election unlimited, first Director elected by the founding assembly; dismissal of the Director only for cause by two-thirds of all members; the Director decides everything not reserved to another body; the President of the Assembly and the President of the Board break ties, except on pay, dismissals and the Director's report; a founder can be expelled only by two-thirds of all members; the fee is a yearly Assembly decision and may be zero. Each is one number or one sentence to change.</w:t>
+            </w:r>
+          </w:p>
+        </w:tc>
+      </w:tr>
+      <w:tr>
+        <w:tc>
+          <w:tcPr>
+            <w:tcW w:type="dxa" w:w="4953"/>
+            <w:tcMar>
+              <w:top w:type="dxa" w:w="80"/>
+              <w:left w:type="dxa" w:w="100"/>
+              <w:bottom w:type="dxa" w:w="80"/>
+              <w:right w:type="dxa" w:w="100"/>
+            </w:tcMar>
+          </w:tcPr>
+          <w:p>
+            <w:pPr>
+              <w:spacing w:after="100"/>
+            </w:pPr>
+            <w:r>
+              <w:rPr>
+                <w:rFonts w:ascii="Arial" w:cs="Arial" w:eastAsia="Arial" w:hAnsi="Arial"/>
+                <w:b/>
+                <w:bCs/>
+                <w:sz w:val="18"/>
+                <w:szCs w:val="18"/>
+              </w:rPr>
+              <w:t xml:space="preserve">Odluke sadržane ovdje.</w:t>
+            </w:r>
+            <w:r>
+              <w:rPr>
+                <w:rFonts w:ascii="Arial" w:cs="Arial" w:eastAsia="Arial" w:hAnsi="Arial"/>
+                <w:sz w:val="18"/>
+                <w:szCs w:val="18"/>
+              </w:rPr>
+              <w:t xml:space="preserve"> Mandat direktora pet godina, ponovni izbor bez ograničenja, prvog direktora bira osnivačka skupština; razrješenje direktora samo iz razloga i dvotrećinskom većinom svih članova; direktor odlučuje o svemu što nije u nadležnosti drugog organa; Predsjednik Skupštine i predsjednik Upravnog odbora odlučuju kod jednakog broja glasova, osim o zaradama, razrješenjima i izvještaju direktora; osnivač se može isključiti samo dvotrećinskom većinom svih članova; članarina je godišnja odluka Skupštine i može biti nula. Svako je jedan broj ili jedna rečenica za izmjenu.</w:t>
+            </w:r>
+          </w:p>
+        </w:tc>
+        <w:tc>
+          <w:tcPr>
+            <w:tcW w:type="dxa" w:w="4953"/>
+            <w:tcMar>
+              <w:top w:type="dxa" w:w="80"/>
+              <w:left w:type="dxa" w:w="100"/>
+              <w:bottom w:type="dxa" w:w="80"/>
+              <w:right w:type="dxa" w:w="100"/>
+            </w:tcMar>
+          </w:tcPr>
+          <w:p>
+            <w:pPr>
+              <w:spacing w:after="100"/>
+            </w:pPr>
+            <w:r>
+              <w:rPr>
+                <w:rFonts w:ascii="Arial" w:cs="Arial" w:eastAsia="Arial" w:hAnsi="Arial"/>
+                <w:b/>
+                <w:bCs/>
+                <w:sz w:val="18"/>
+                <w:szCs w:val="18"/>
+              </w:rPr>
+              <w:t xml:space="preserve">What is deliberately not proposed.</w:t>
+            </w:r>
+            <w:r>
+              <w:rPr>
+                <w:rFonts w:ascii="Arial" w:cs="Arial" w:eastAsia="Arial" w:hAnsi="Arial"/>
+                <w:sz w:val="18"/>
+                <w:szCs w:val="18"/>
+              </w:rPr>
+              <w:t xml:space="preserve"> A lifetime or non-removable Executive Director, a founder's veto over the Board or the Grants Committee, and a founder's seat on the Grants Committee. Each would contradict the Law (the Assembly elects and recalls every body), the Ministry's guidance (terms of about four years, recall by the assembly), and the independence promise in the team guide that sponsors and grant funders rely on. A long renewable term with a two-thirds dismissal bar gives the founder the same practical security without those costs.</w:t>
+            </w:r>
+          </w:p>
+        </w:tc>
+      </w:tr>
+      <w:tr>
+        <w:tc>
+          <w:tcPr>
+            <w:tcW w:type="dxa" w:w="4953"/>
+            <w:tcMar>
+              <w:top w:type="dxa" w:w="80"/>
+              <w:left w:type="dxa" w:w="100"/>
+              <w:bottom w:type="dxa" w:w="80"/>
+              <w:right w:type="dxa" w:w="100"/>
+            </w:tcMar>
+          </w:tcPr>
+          <w:p>
+            <w:pPr>
+              <w:spacing w:after="100"/>
+            </w:pPr>
+            <w:r>
+              <w:rPr>
+                <w:rFonts w:ascii="Arial" w:cs="Arial" w:eastAsia="Arial" w:hAnsi="Arial"/>
+                <w:b/>
+                <w:bCs/>
+                <w:sz w:val="18"/>
+                <w:szCs w:val="18"/>
+              </w:rPr>
+              <w:t xml:space="preserve">Šta se namjerno ne predlaže.</w:t>
+            </w:r>
+            <w:r>
+              <w:rPr>
+                <w:rFonts w:ascii="Arial" w:cs="Arial" w:eastAsia="Arial" w:hAnsi="Arial"/>
+                <w:sz w:val="18"/>
+                <w:szCs w:val="18"/>
+              </w:rPr>
+              <w:t xml:space="preserve"> Doživotni ili nesmjenjivi Izvršni direktor, pravo veta osnivača nad Upravnim odborom ili Komisijom i mjesto osnivača u Komisiji. Svako od toga bilo bi suprotno Zakonu (Skupština bira i razrješava sve organe), Uputstvu Ministarstva (mandati od oko četiri godine, opoziv od strane skupštine) i obećanju nezavisnosti iz vodiča za tim na koje se oslanjaju sponzori i donatori grantova. Dug mandat sa mogućnošću ponovnog izbora i dvotrećinski prag za razrješenje daju osnivaču istu praktičnu sigurnost bez tih troškova.</w:t>
+            </w:r>
+          </w:p>
+        </w:tc>
+        <w:tc>
+          <w:tcPr>
+            <w:tcW w:type="dxa" w:w="4953"/>
+            <w:tcMar>
+              <w:top w:type="dxa" w:w="80"/>
+              <w:left w:type="dxa" w:w="100"/>
+              <w:bottom w:type="dxa" w:w="80"/>
+              <w:right w:type="dxa" w:w="100"/>
+            </w:tcMar>
+          </w:tcPr>
+          <w:p>
+            <w:pPr>
+              <w:spacing w:after="100"/>
+            </w:pPr>
+            <w:r>
+              <w:rPr>
+                <w:rFonts w:ascii="Arial" w:cs="Arial" w:eastAsia="Arial" w:hAnsi="Arial"/>
+                <w:b/>
+                <w:bCs/>
+                <w:sz w:val="18"/>
+                <w:szCs w:val="18"/>
+              </w:rPr>
+              <w:t xml:space="preserve">How the roles line up once adopted.</w:t>
+            </w:r>
+            <w:r>
+              <w:rPr>
+                <w:rFonts w:ascii="Arial" w:cs="Arial" w:eastAsia="Arial" w:hAnsi="Arial"/>
+                <w:sz w:val="18"/>
+                <w:szCs w:val="18"/>
+              </w:rPr>
+              <w:t xml:space="preserve"> The Assembly, meaning every member, elects and recalls the bodies and amends the statute. The Board governs between Assemblies and owns strategy, budget, staffing and pay. The Grants Committee alone decides who receives funds. The Executive Director, the founder in the first term, represents the association, runs operations and decides everything not reserved to the others. Team leads, chapter officers and staff report to the Director; volunteers report to them. The membership policy and the organisation document in </w:t>
+            </w:r>
+            <w:r>
+              <w:rPr>
+                <w:rFonts w:ascii="Courier New" w:cs="Courier New" w:eastAsia="Courier New" w:hAnsi="Courier New"/>
+                <w:sz w:val="18"/>
+                <w:szCs w:val="18"/>
+              </w:rPr>
+              <w:t xml:space="preserve">docs/legal/governance/</w:t>
+            </w:r>
+            <w:r>
+              <w:rPr>
+                <w:rFonts w:ascii="Arial" w:cs="Arial" w:eastAsia="Arial" w:hAnsi="Arial"/>
+                <w:sz w:val="18"/>
+                <w:szCs w:val="18"/>
+              </w:rPr>
+              <w:t xml:space="preserve"> describe this in full.</w:t>
+            </w:r>
+          </w:p>
+        </w:tc>
+      </w:tr>
+      <w:tr>
+        <w:tc>
+          <w:tcPr>
+            <w:tcW w:type="dxa" w:w="9906"/>
+            <w:gridSpan w:val="2"/>
+            <w:tcMar>
+              <w:top w:type="dxa" w:w="80"/>
+              <w:left w:type="dxa" w:w="100"/>
+              <w:bottom w:type="dxa" w:w="80"/>
+              <w:right w:type="dxa" w:w="100"/>
+            </w:tcMar>
+          </w:tcPr>
+          <w:p>
+            <w:pPr>
+              <w:spacing w:after="100"/>
+            </w:pPr>
+            <w:r>
+              <w:rPr>
+                <w:rFonts w:ascii="Arial" w:cs="Arial" w:eastAsia="Arial" w:hAnsi="Arial"/>
+                <w:b/>
+                <w:bCs/>
+                <w:sz w:val="18"/>
+                <w:szCs w:val="18"/>
+              </w:rPr>
+              <w:t xml:space="preserve">Kako se funkcije slažu nakon usvajanja.</w:t>
+            </w:r>
+            <w:r>
+              <w:rPr>
+                <w:rFonts w:ascii="Arial" w:cs="Arial" w:eastAsia="Arial" w:hAnsi="Arial"/>
+                <w:sz w:val="18"/>
+                <w:szCs w:val="18"/>
+              </w:rPr>
+              <w:t xml:space="preserve"> Skupština, odnosno svi članovi, bira i razrješava organe i mijenja statut. Upravni odbor upravlja između sjednica Skupštine i odgovoran je za strategiju, budžet, zapošljavanje i zarade. Komisija za dodjelu sredstava sama odlučuje ko dobija sredstva. Izvršni direktor, u prvom mandatu osnivač, zastupa udruženje, vodi poslovanje i odlučuje o svemu što nije u nadležnosti drugih. Rukovodioci timova, funkcioneri ogranaka i zaposleni odgovaraju direktoru; volonteri odgovaraju njima. Politika članstva i dokument o organizaciji u </w:t>
+            </w:r>
+            <w:r>
+              <w:rPr>
+                <w:rFonts w:ascii="Courier New" w:cs="Courier New" w:eastAsia="Courier New" w:hAnsi="Courier New"/>
+                <w:sz w:val="18"/>
+                <w:szCs w:val="18"/>
+              </w:rPr>
+              <w:t xml:space="preserve">docs/legal/governance/</w:t>
+            </w:r>
+            <w:r>
+              <w:rPr>
+                <w:rFonts w:ascii="Arial" w:cs="Arial" w:eastAsia="Arial" w:hAnsi="Arial"/>
+                <w:sz w:val="18"/>
+                <w:szCs w:val="18"/>
+              </w:rPr>
+              <w:t xml:space="preserve"> opisuju to u cjelini.</w:t>
+            </w:r>
+          </w:p>
+        </w:tc>
+      </w:tr>
+      <w:tr>
+        <w:tc>
+          <w:tcPr>
+            <w:tcW w:type="dxa" w:w="4953"/>
+            <w:shd w:fill="E3EBED" w:color="auto" w:val="clear"/>
+            <w:tcMar>
+              <w:top w:type="dxa" w:w="80"/>
+              <w:left w:type="dxa" w:w="100"/>
+              <w:bottom w:type="dxa" w:w="80"/>
+              <w:right w:type="dxa" w:w="100"/>
+            </w:tcMar>
+          </w:tcPr>
+          <w:p>
+            <w:r>
+              <w:rPr>
+                <w:rFonts w:ascii="Arial" w:cs="Arial" w:eastAsia="Arial" w:hAnsi="Arial"/>
+                <w:b/>
+                <w:bCs/>
+                <w:color w:val="0E3A46"/>
+                <w:sz w:val="22"/>
+                <w:szCs w:val="22"/>
+              </w:rPr>
+              <w:t xml:space="preserve">Pitanja za advokata</w:t>
+            </w:r>
+          </w:p>
+        </w:tc>
+        <w:tc>
+          <w:tcPr>
+            <w:tcW w:type="dxa" w:w="4953"/>
+            <w:shd w:fill="E3EBED" w:color="auto" w:val="clear"/>
+            <w:tcMar>
+              <w:top w:type="dxa" w:w="80"/>
+              <w:left w:type="dxa" w:w="100"/>
+              <w:bottom w:type="dxa" w:w="80"/>
+              <w:right w:type="dxa" w:w="100"/>
+            </w:tcMar>
+          </w:tcPr>
+          <w:p>
+            <w:r>
+              <w:rPr>
+                <w:rFonts w:ascii="Arial" w:cs="Arial" w:eastAsia="Arial" w:hAnsi="Arial"/>
+                <w:b/>
+                <w:bCs/>
+                <w:color w:val="0E3A46"/>
+                <w:sz w:val="22"/>
+                <w:szCs w:val="22"/>
+              </w:rPr>
+              <w:t xml:space="preserve">7. Points for the lawyer</w:t>
             </w:r>
           </w:p>
         </w:tc>
@@ -4483,6 +5667,96 @@
                 <w:szCs w:val="18"/>
               </w:rPr>
               <w:t xml:space="preserve">Renumber all articles and cross-references once the insertions are final. / Prenumerisati sve članove i upućivanja kada dopune budu konačne.</w:t>
+            </w:r>
+          </w:p>
+          <w:p>
+            <w:pPr>
+              <w:pStyle w:val="ListParagraph"/>
+              <w:numPr>
+                <w:ilvl w:val="0"/>
+                <w:numId w:val="5"/>
+              </w:numPr>
+              <w:spacing w:after="40"/>
+            </w:pPr>
+            <w:r>
+              <w:rPr>
+                <w:rFonts w:ascii="Arial" w:cs="Arial" w:eastAsia="Arial" w:hAnsi="Arial"/>
+                <w:sz w:val="18"/>
+                <w:szCs w:val="18"/>
+              </w:rPr>
+              <w:t xml:space="preserve">Confirm that a five-year term for the Executive Director with unlimited re-election is acceptable under Article 23 of the Law and the Ministry's guidance (section 6). / Potvrditi da je petogodišnji mandat Izvršnog direktora sa neograničenim ponovnim izborom prihvatljiv prema čl. 23 Zakona i Uputstvu Ministarstva (odjeljak 6).</w:t>
+            </w:r>
+          </w:p>
+          <w:p>
+            <w:pPr>
+              <w:pStyle w:val="ListParagraph"/>
+              <w:numPr>
+                <w:ilvl w:val="0"/>
+                <w:numId w:val="5"/>
+              </w:numPr>
+              <w:spacing w:after="40"/>
+            </w:pPr>
+            <w:r>
+              <w:rPr>
+                <w:rFonts w:ascii="Arial" w:cs="Arial" w:eastAsia="Arial" w:hAnsi="Arial"/>
+                <w:sz w:val="18"/>
+                <w:szCs w:val="18"/>
+              </w:rPr>
+              <w:t xml:space="preserve">Confirm that a two-thirds majority of all members for the early dismissal of the Director and for the expulsion of a founder may be set by the statute, and does not conflict with the Assembly's power to recall under the Law. / Potvrditi da statut može propisati dvotrećinsku većinu svih članova za prijevremeno razrješenje direktora i isključenje osnivača, i da to nije u sukobu sa zakonskim pravom Skupštine na opoziv.</w:t>
+            </w:r>
+          </w:p>
+          <w:p>
+            <w:pPr>
+              <w:pStyle w:val="ListParagraph"/>
+              <w:numPr>
+                <w:ilvl w:val="0"/>
+                <w:numId w:val="5"/>
+              </w:numPr>
+              <w:spacing w:after="40"/>
+            </w:pPr>
+            <w:r>
+              <w:rPr>
+                <w:rFonts w:ascii="Arial" w:cs="Arial" w:eastAsia="Arial" w:hAnsi="Arial"/>
+                <w:sz w:val="18"/>
+                <w:szCs w:val="18"/>
+              </w:rPr>
+              <w:t xml:space="preserve">Confirm that a casting vote of the President of the Assembly and of the President of the Board is permissible, given that the Law speaks only of majority decisions. / Potvrditi da je dozvoljen odlučujući glas Predsjednika Skupštine i predsjednika Upravnog odbora, s obzirom na to da Zakon govori samo o većinskom odlučivanju.</w:t>
+            </w:r>
+          </w:p>
+          <w:p>
+            <w:pPr>
+              <w:pStyle w:val="ListParagraph"/>
+              <w:numPr>
+                <w:ilvl w:val="0"/>
+                <w:numId w:val="5"/>
+              </w:numPr>
+              <w:spacing w:after="40"/>
+            </w:pPr>
+            <w:r>
+              <w:rPr>
+                <w:rFonts w:ascii="Arial" w:cs="Arial" w:eastAsia="Arial" w:hAnsi="Arial"/>
+                <w:sz w:val="18"/>
+                <w:szCs w:val="18"/>
+              </w:rPr>
+              <w:t xml:space="preserve">Confirm that the Director acting after a tied or inquorate Board (Art. 28 addition) does not make the Director liable for a decision the Board should have taken. / Potvrditi da postupanje direktora poslije neodlučnog ili nekvorumskog Upravnog odbora (dopuna čl. 28) ne čini direktora odgovornim za odluku koju je trebalo da donese Upravni odbor.</w:t>
+            </w:r>
+          </w:p>
+          <w:p>
+            <w:pPr>
+              <w:pStyle w:val="ListParagraph"/>
+              <w:numPr>
+                <w:ilvl w:val="0"/>
+                <w:numId w:val="5"/>
+              </w:numPr>
+              <w:spacing w:after="40"/>
+            </w:pPr>
+            <w:r>
+              <w:rPr>
+                <w:rFonts w:ascii="Arial" w:cs="Arial" w:eastAsia="Arial" w:hAnsi="Arial"/>
+                <w:sz w:val="18"/>
+                <w:szCs w:val="18"/>
+              </w:rPr>
+              <w:t xml:space="preserve">Confirm that "pay the membership fee, if the Assembly has set one" satisfies the membership-fee wording the Law expects, and whether the 2026 waiver should be a decision of the founding assembly. / Potvrditi da „plaća članarinu, ako ju je Skupština utvrdila“ odgovara zakonskom očekivanju o članarini, i da li oslobađanje za 2026. treba da bude odluka osnivačke skupštine.</w:t>
             </w:r>
           </w:p>
         </w:tc>

</xml_diff>